<commit_message>
Système d'Importation des agents
</commit_message>
<xml_diff>
--- a/BACKEND/assets/export/chu/enteteCHU - Copie.docx
+++ b/BACKEND/assets/export/chu/enteteCHU - Copie.docx
@@ -390,6 +390,39 @@
               </w:rPr>
               <w:t>PRIX UNITAIRE</w:t>
             </w:r>
+            <w:r>
+              <w:rPr>
+                <w:rFonts w:ascii="Times New Roman" w:hAnsi="Times New Roman" w:cs="Times New Roman"/>
+                <w:color w:val="0D0D0D" w:themeColor="text1" w:themeTint="F2"/>
+                <w:sz w:val="24"/>
+                <w:szCs w:val="24"/>
+                <w:lang w:val="fr-CD"/>
+              </w:rPr>
+              <w:t xml:space="preserve">(en </w:t>
+            </w:r>
+            <w:proofErr w:type="spellStart"/>
+            <w:r>
+              <w:rPr>
+                <w:rFonts w:ascii="Times New Roman" w:hAnsi="Times New Roman" w:cs="Times New Roman"/>
+                <w:b/>
+                <w:color w:val="0D0D0D" w:themeColor="text1" w:themeTint="F2"/>
+                <w:sz w:val="24"/>
+                <w:szCs w:val="24"/>
+                <w:lang w:val="fr-CD"/>
+              </w:rPr>
+              <w:t>Fc</w:t>
+            </w:r>
+            <w:proofErr w:type="spellEnd"/>
+            <w:r>
+              <w:rPr>
+                <w:rFonts w:ascii="Times New Roman" w:hAnsi="Times New Roman" w:cs="Times New Roman"/>
+                <w:color w:val="0D0D0D" w:themeColor="text1" w:themeTint="F2"/>
+                <w:sz w:val="24"/>
+                <w:szCs w:val="24"/>
+                <w:lang w:val="fr-CD"/>
+              </w:rPr>
+              <w:t>)</w:t>
+            </w:r>
           </w:p>
         </w:tc>
         <w:tc>
@@ -456,6 +489,7 @@
             <w:r>
               <w:rPr>
                 <w:rFonts w:ascii="Times New Roman" w:hAnsi="Times New Roman" w:cs="Times New Roman"/>
+                <w:b/>
                 <w:color w:val="0D0D0D" w:themeColor="text1" w:themeTint="F2"/>
                 <w:sz w:val="24"/>
                 <w:szCs w:val="24"/>
@@ -600,8 +634,6 @@
               </w:rPr>
               <w:t>.</w:t>
             </w:r>
-            <w:bookmarkStart w:id="0" w:name="_GoBack"/>
-            <w:bookmarkEnd w:id="0"/>
           </w:p>
         </w:tc>
         <w:tc>
@@ -908,6 +940,160 @@
       <w:tr>
         <w:tc>
           <w:tcPr>
+            <w:tcW w:w="486" w:type="dxa"/>
+          </w:tcPr>
+          <w:p>
+            <w:pPr>
+              <w:rPr>
+                <w:rFonts w:ascii="Times New Roman" w:hAnsi="Times New Roman" w:cs="Times New Roman"/>
+                <w:color w:val="0D0D0D" w:themeColor="text1" w:themeTint="F2"/>
+                <w:sz w:val="24"/>
+                <w:szCs w:val="24"/>
+                <w:lang w:val="fr-CD"/>
+              </w:rPr>
+            </w:pPr>
+            <w:r>
+              <w:rPr>
+                <w:rFonts w:ascii="Times New Roman" w:hAnsi="Times New Roman" w:cs="Times New Roman"/>
+                <w:color w:val="0D0D0D" w:themeColor="text1" w:themeTint="F2"/>
+                <w:sz w:val="24"/>
+                <w:szCs w:val="24"/>
+                <w:lang w:val="fr-CD"/>
+              </w:rPr>
+              <w:t>4</w:t>
+            </w:r>
+          </w:p>
+        </w:tc>
+        <w:tc>
+          <w:tcPr>
+            <w:tcW w:w="3371" w:type="dxa"/>
+          </w:tcPr>
+          <w:p>
+            <w:pPr>
+              <w:rPr>
+                <w:rFonts w:ascii="Times New Roman" w:hAnsi="Times New Roman" w:cs="Times New Roman"/>
+                <w:color w:val="0D0D0D" w:themeColor="text1" w:themeTint="F2"/>
+                <w:sz w:val="24"/>
+                <w:szCs w:val="24"/>
+                <w:lang w:val="fr-CD"/>
+              </w:rPr>
+            </w:pPr>
+            <w:r>
+              <w:rPr>
+                <w:rFonts w:ascii="Times New Roman" w:hAnsi="Times New Roman" w:cs="Times New Roman"/>
+                <w:color w:val="0D0D0D" w:themeColor="text1" w:themeTint="F2"/>
+                <w:sz w:val="24"/>
+                <w:szCs w:val="24"/>
+                <w:lang w:val="fr-CD"/>
+              </w:rPr>
+              <w:t xml:space="preserve">Imprimante </w:t>
+            </w:r>
+            <w:proofErr w:type="spellStart"/>
+            <w:r>
+              <w:rPr>
+                <w:rFonts w:ascii="Times New Roman" w:hAnsi="Times New Roman" w:cs="Times New Roman"/>
+                <w:color w:val="0D0D0D" w:themeColor="text1" w:themeTint="F2"/>
+                <w:sz w:val="24"/>
+                <w:szCs w:val="24"/>
+                <w:lang w:val="fr-CD"/>
+              </w:rPr>
+              <w:t>Lazer</w:t>
+            </w:r>
+            <w:proofErr w:type="spellEnd"/>
+            <w:r>
+              <w:rPr>
+                <w:rFonts w:ascii="Times New Roman" w:hAnsi="Times New Roman" w:cs="Times New Roman"/>
+                <w:color w:val="0D0D0D" w:themeColor="text1" w:themeTint="F2"/>
+                <w:sz w:val="24"/>
+                <w:szCs w:val="24"/>
+                <w:lang w:val="fr-CD"/>
+              </w:rPr>
+              <w:t xml:space="preserve"> MFP 135A</w:t>
+            </w:r>
+          </w:p>
+        </w:tc>
+        <w:tc>
+          <w:tcPr>
+            <w:tcW w:w="2082" w:type="dxa"/>
+          </w:tcPr>
+          <w:p>
+            <w:pPr>
+              <w:rPr>
+                <w:rFonts w:ascii="Times New Roman" w:hAnsi="Times New Roman" w:cs="Times New Roman"/>
+                <w:color w:val="0D0D0D" w:themeColor="text1" w:themeTint="F2"/>
+                <w:sz w:val="24"/>
+                <w:szCs w:val="24"/>
+                <w:lang w:val="fr-CD"/>
+              </w:rPr>
+            </w:pPr>
+            <w:r>
+              <w:rPr>
+                <w:rFonts w:ascii="Times New Roman" w:hAnsi="Times New Roman" w:cs="Times New Roman"/>
+                <w:color w:val="0D0D0D" w:themeColor="text1" w:themeTint="F2"/>
+                <w:sz w:val="24"/>
+                <w:szCs w:val="24"/>
+                <w:lang w:val="fr-CD"/>
+              </w:rPr>
+              <w:t>805000 (350$)</w:t>
+            </w:r>
+          </w:p>
+        </w:tc>
+        <w:tc>
+          <w:tcPr>
+            <w:tcW w:w="1860" w:type="dxa"/>
+          </w:tcPr>
+          <w:p>
+            <w:pPr>
+              <w:rPr>
+                <w:rFonts w:ascii="Times New Roman" w:hAnsi="Times New Roman" w:cs="Times New Roman"/>
+                <w:color w:val="0D0D0D" w:themeColor="text1" w:themeTint="F2"/>
+                <w:sz w:val="24"/>
+                <w:szCs w:val="24"/>
+                <w:lang w:val="fr-CD"/>
+              </w:rPr>
+            </w:pPr>
+            <w:r>
+              <w:rPr>
+                <w:rFonts w:ascii="Times New Roman" w:hAnsi="Times New Roman" w:cs="Times New Roman"/>
+                <w:color w:val="0D0D0D" w:themeColor="text1" w:themeTint="F2"/>
+                <w:sz w:val="24"/>
+                <w:szCs w:val="24"/>
+                <w:lang w:val="fr-CD"/>
+              </w:rPr>
+              <w:t>1</w:t>
+            </w:r>
+          </w:p>
+        </w:tc>
+        <w:tc>
+          <w:tcPr>
+            <w:tcW w:w="1597" w:type="dxa"/>
+          </w:tcPr>
+          <w:p>
+            <w:pPr>
+              <w:rPr>
+                <w:rFonts w:ascii="Times New Roman" w:hAnsi="Times New Roman" w:cs="Times New Roman"/>
+                <w:color w:val="0D0D0D" w:themeColor="text1" w:themeTint="F2"/>
+                <w:sz w:val="24"/>
+                <w:szCs w:val="24"/>
+                <w:lang w:val="fr-CD"/>
+              </w:rPr>
+            </w:pPr>
+            <w:r>
+              <w:rPr>
+                <w:rFonts w:ascii="Times New Roman" w:hAnsi="Times New Roman" w:cs="Times New Roman"/>
+                <w:color w:val="0D0D0D" w:themeColor="text1" w:themeTint="F2"/>
+                <w:sz w:val="24"/>
+                <w:szCs w:val="24"/>
+                <w:lang w:val="fr-CD"/>
+              </w:rPr>
+              <w:t>805000</w:t>
+            </w:r>
+          </w:p>
+        </w:tc>
+      </w:tr>
+      <w:tr>
+        <w:tc>
+          <w:tcPr>
             <w:tcW w:w="7799" w:type="dxa"/>
             <w:gridSpan w:val="4"/>
           </w:tcPr>
@@ -959,7 +1145,7 @@
                 <w:szCs w:val="24"/>
                 <w:lang w:val="fr-CD"/>
               </w:rPr>
-              <w:t>243100</w:t>
+              <w:t>1.039.000</w:t>
             </w:r>
           </w:p>
         </w:tc>
@@ -1091,7 +1277,16 @@
           <w:szCs w:val="24"/>
           <w:lang w:val="fr-CD"/>
         </w:rPr>
-        <w:t>Fait à Boma, le 11/09/2026</w:t>
+        <w:t>Fait à Boma, le 15</w:t>
+      </w:r>
+      <w:r>
+        <w:rPr>
+          <w:rFonts w:ascii="Forte" w:hAnsi="Forte" w:cs="Times New Roman"/>
+          <w:sz w:val="28"/>
+          <w:szCs w:val="24"/>
+          <w:lang w:val="fr-CD"/>
+        </w:rPr>
+        <w:t>/09/2026</w:t>
       </w:r>
     </w:p>
     <w:sectPr>
@@ -1150,8 +1345,9 @@
   <w:p>
     <w:pPr>
       <w:pStyle w:val="Pieddepage"/>
-      <w:jc w:val="both"/>
+      <w:jc w:val="center"/>
     </w:pPr>
+    <w:bookmarkStart w:id="0" w:name="_GoBack"/>
     <w:r>
       <w:t xml:space="preserve">N° 186 </w:t>
     </w:r>
@@ -1225,13 +1421,13 @@
     </w:r>
     <w:proofErr w:type="spellEnd"/>
     <w:r>
-      <w:t xml:space="preserve"> du Congo; B.P 314; </w:t>
+      <w:t xml:space="preserve"> du Congo; B.P 314;</w:t>
     </w:r>
   </w:p>
   <w:p>
     <w:pPr>
       <w:pStyle w:val="Pieddepage"/>
-      <w:jc w:val="both"/>
+      <w:jc w:val="center"/>
     </w:pPr>
     <w:r>
       <w:t xml:space="preserve">(+243) 821 944 140– 89 995 683 6; E-mail: </w:t>
@@ -1251,6 +1447,7 @@
       </w:rPr>
       <w:t>www.chu-ukv.cd</w:t>
     </w:r>
+    <w:bookmarkEnd w:id="0"/>
   </w:p>
 </w:ftr>
 </file>

</xml_diff>

<commit_message>
Correction Module APT physique
</commit_message>
<xml_diff>
--- a/BACKEND/assets/export/chu/enteteCHU - Copie.docx
+++ b/BACKEND/assets/export/chu/enteteCHU - Copie.docx
@@ -988,38 +988,16 @@
                 <w:lang w:val="fr-CD"/>
               </w:rPr>
             </w:pPr>
-            <w:r>
-              <w:rPr>
-                <w:rFonts w:ascii="Times New Roman" w:hAnsi="Times New Roman" w:cs="Times New Roman"/>
-                <w:color w:val="0D0D0D" w:themeColor="text1" w:themeTint="F2"/>
-                <w:sz w:val="24"/>
-                <w:szCs w:val="24"/>
-                <w:lang w:val="fr-CD"/>
-              </w:rPr>
-              <w:t xml:space="preserve">Imprimante </w:t>
-            </w:r>
-            <w:proofErr w:type="spellStart"/>
-            <w:r>
-              <w:rPr>
-                <w:rFonts w:ascii="Times New Roman" w:hAnsi="Times New Roman" w:cs="Times New Roman"/>
-                <w:color w:val="0D0D0D" w:themeColor="text1" w:themeTint="F2"/>
-                <w:sz w:val="24"/>
-                <w:szCs w:val="24"/>
-                <w:lang w:val="fr-CD"/>
-              </w:rPr>
-              <w:t>Lazer</w:t>
-            </w:r>
-            <w:proofErr w:type="spellEnd"/>
-            <w:r>
-              <w:rPr>
-                <w:rFonts w:ascii="Times New Roman" w:hAnsi="Times New Roman" w:cs="Times New Roman"/>
-                <w:color w:val="0D0D0D" w:themeColor="text1" w:themeTint="F2"/>
-                <w:sz w:val="24"/>
-                <w:szCs w:val="24"/>
-                <w:lang w:val="fr-CD"/>
-              </w:rPr>
-              <w:t xml:space="preserve"> MFP 135A</w:t>
-            </w:r>
+            <w:bookmarkStart w:id="0" w:name="_GoBack"/>
+            <w:r>
+              <w:rPr>
+                <w:rStyle w:val="citation-79"/>
+                <w:bCs/>
+                <w:sz w:val="24"/>
+              </w:rPr>
+              <w:t>HP Laser MFP 137fnw</w:t>
+            </w:r>
+            <w:bookmarkEnd w:id="0"/>
           </w:p>
         </w:tc>
         <w:tc>
@@ -1044,7 +1022,17 @@
                 <w:szCs w:val="24"/>
                 <w:lang w:val="fr-CD"/>
               </w:rPr>
-              <w:t>805000 (350$)</w:t>
+              <w:t>1035000 (4</w:t>
+            </w:r>
+            <w:r>
+              <w:rPr>
+                <w:rFonts w:ascii="Times New Roman" w:hAnsi="Times New Roman" w:cs="Times New Roman"/>
+                <w:color w:val="0D0D0D" w:themeColor="text1" w:themeTint="F2"/>
+                <w:sz w:val="24"/>
+                <w:szCs w:val="24"/>
+                <w:lang w:val="fr-CD"/>
+              </w:rPr>
+              <w:t>50$)</w:t>
             </w:r>
           </w:p>
         </w:tc>
@@ -1096,7 +1084,37 @@
                 <w:szCs w:val="24"/>
                 <w:lang w:val="fr-CD"/>
               </w:rPr>
-              <w:t>805000</w:t>
+              <w:t>1</w:t>
+            </w:r>
+            <w:r>
+              <w:rPr>
+                <w:rFonts w:ascii="Times New Roman" w:hAnsi="Times New Roman" w:cs="Times New Roman"/>
+                <w:color w:val="0D0D0D" w:themeColor="text1" w:themeTint="F2"/>
+                <w:sz w:val="24"/>
+                <w:szCs w:val="24"/>
+                <w:lang w:val="fr-CD"/>
+              </w:rPr>
+              <w:t>0</w:t>
+            </w:r>
+            <w:r>
+              <w:rPr>
+                <w:rFonts w:ascii="Times New Roman" w:hAnsi="Times New Roman" w:cs="Times New Roman"/>
+                <w:color w:val="0D0D0D" w:themeColor="text1" w:themeTint="F2"/>
+                <w:sz w:val="24"/>
+                <w:szCs w:val="24"/>
+                <w:lang w:val="fr-CD"/>
+              </w:rPr>
+              <w:t>3</w:t>
+            </w:r>
+            <w:r>
+              <w:rPr>
+                <w:rFonts w:ascii="Times New Roman" w:hAnsi="Times New Roman" w:cs="Times New Roman"/>
+                <w:color w:val="0D0D0D" w:themeColor="text1" w:themeTint="F2"/>
+                <w:sz w:val="24"/>
+                <w:szCs w:val="24"/>
+                <w:lang w:val="fr-CD"/>
+              </w:rPr>
+              <w:t>5000</w:t>
             </w:r>
           </w:p>
         </w:tc>
@@ -1155,10 +1173,8 @@
                 <w:szCs w:val="24"/>
                 <w:lang w:val="fr-CD"/>
               </w:rPr>
-              <w:t>1.00</w:t>
-            </w:r>
-            <w:bookmarkStart w:id="0" w:name="_GoBack"/>
-            <w:bookmarkEnd w:id="0"/>
+              <w:t>1.23</w:t>
+            </w:r>
             <w:r>
               <w:rPr>
                 <w:rFonts w:ascii="Times New Roman" w:hAnsi="Times New Roman" w:cs="Times New Roman"/>
@@ -2052,6 +2068,11 @@
       <w:szCs w:val="18"/>
     </w:rPr>
   </w:style>
+  <w:style w:type="character" w:customStyle="1" w:styleId="citation-79">
+    <w:name w:val="citation-79"/>
+    <w:basedOn w:val="Policepardfaut"/>
+    <w:rsid w:val="00D457F3"/>
+  </w:style>
 </w:styles>
 </file>
 

</xml_diff>